<commit_message>
In M16 de twee opsommingen gecombineerd in 1 tabel.
In M16 "Het project gebruikt tools voor vastgestelde taken" de opsomming van taken gecombineerd met de opsomming van tools in één tabel.

Closes #937.
</commit_message>
<xml_diff>
--- a/docs/wip/ICTU-Template-Detailtestplan-Softwarerealisatie.docx
+++ b/docs/wip/ICTU-Template-Detailtestplan-Softwarerealisatie.docx
@@ -1136,7 +1136,7 @@
     </w:p>
     <w:p>
       <w:r>
-        <w:t>Versie wip, 04-03-2025</w:t>
+        <w:t>Versie wip, 21-03-2025</w:t>
       </w:r>
     </w:p>
     <w:p>
@@ -2313,7 +2313,7 @@
         <w:t>Securitytesten:</w:t>
       </w:r>
       <w:r>
-        <w:t xml:space="preserve"> Security- en penetratietesten uitgevoerd door een externe partij. Normaliter worden deze minimaal twee maal per jaar of met elke grote release uitgevoerd en niet elke sprint. Securitytesten vinden bij voorkeur plaats in een productie-like omgeving, maar kunnen ook in een niet-productie-like omgeving plaatsvinden ten behoeve van het testen van de beveiliging van de software zelf. De securitytest is inclusief een review van de broncode. Tijdens de realisatie draaien standaard al de volgende securitytesttools mee in de geautomatiseerde pijplijn: SonarQube, OWASP Dependency-Check en/of Dependency-Track, ZAP by Checkmarx en OpenVAS; de bevindingen die uit deze tools komen worden meteen tijdens de realisatie van het systeem opgepakt.</w:t>
+        <w:t xml:space="preserve"> Security- en penetratietesten uitgevoerd door een externe partij. Normaliter worden deze minimaal twee maal per jaar of met elke grote release uitgevoerd en niet elke sprint. Securitytesten vinden bij voorkeur plaats in een productie-like omgeving, maar kunnen ook in een niet-productie-like omgeving plaatsvinden ten behoeve van het testen van de beveiliging van de software zelf. De securitytest is inclusief een review van de broncode. Tijdens de realisatie draaien standaard al de volgende securitytesttools mee in de geautomatiseerde pijplijn: SonarQube, OWASP Dependency-Check en/of Dependency-Track en ZAP by Checkmarx; de bevindingen die uit deze tools komen worden meteen tijdens de realisatie van het systeem opgepakt.</w:t>
       </w:r>
     </w:p>
     <w:p>

</xml_diff>